<commit_message>
feat: grant owner role full workspace capabilities
</commit_message>
<xml_diff>
--- a/docs/generated/FormuLab-User-Guide.docx
+++ b/docs/generated/FormuLab-User-Guide.docx
@@ -1795,7 +1795,7 @@
           <w:b w:val="false"/>
           <w:bCs w:val="false"/>
         </w:rPr>
-        <w:t xml:space="preserve">General — the raw-materials/pricing screen (§6), your workspace folder (where projects/sessions/formulas live on disk — change or reveal it in Explorer/Finder), and app updates (manual check, auto-check toggle, update-badge visibility).</w:t>
+        <w:t xml:space="preserve">General — the raw-materials/pricing screen (§6), your workspace folder (where projects/sessions/formulas live on disk — change or reveal it in Explorer/Finder), your Active Data Location, Backup and Recovery, Automatic Backups, Schema Migration, Diagnostics, and App Updates (all in §28a).</w:t>
       </w:r>
     </w:p>
     <w:p>
@@ -1886,6 +1886,797 @@
           <w:color w:val="888888"/>
         </w:rPr>
         <w:t xml:space="preserve">[Screenshot not yet captured: Settings]</w:t>
+      </w:r>
+    </w:p>
+    <w:p>
+      <w:pPr>
+        <w:pStyle w:val="Heading2"/>
+      </w:pPr>
+      <w:r>
+        <w:t xml:space="preserve">28a. Backup and Recovery</w:t>
+      </w:r>
+    </w:p>
+    <w:p>
+      <w:r>
+        <w:rPr>
+          <w:b w:val="false"/>
+          <w:bCs w:val="false"/>
+        </w:rPr>
+        <w:t xml:space="preserve">Inserted section — does not renumber §29/§30 below.</w:t>
+      </w:r>
+    </w:p>
+    <w:p>
+      <w:r>
+        <w:rPr>
+          <w:b w:val="false"/>
+          <w:bCs w:val="false"/>
+        </w:rPr>
+        <w:t xml:space="preserve">Settings → General → Active Data Location — shows exactly where your formulations, master data, sessions and formulas live right now, how that was decided, and lets you safely relocate that folder.</w:t>
+      </w:r>
+    </w:p>
+    <w:p>
+      <w:pPr>
+        <w:pStyle w:val="ListParagraph"/>
+        <w:numPr>
+          <w:ilvl w:val="0"/>
+          <w:numId w:val="1"/>
+        </w:numPr>
+      </w:pPr>
+      <w:r>
+        <w:rPr>
+          <w:b w:val="false"/>
+          <w:bCs w:val="false"/>
+        </w:rPr>
+        <w:t xml:space="preserve">Resolved from tells you which setting produced the path: your workspace folder (the normal case), an active-workspace override, a manual formulab-root.txt override, or the built-in default (~/Documents/FormuLab) if nothing is configured yet.</w:t>
+      </w:r>
+    </w:p>
+    <w:p>
+      <w:pPr>
+        <w:pStyle w:val="ListParagraph"/>
+        <w:numPr>
+          <w:ilvl w:val="0"/>
+          <w:numId w:val="1"/>
+        </w:numPr>
+      </w:pPr>
+      <w:r>
+        <w:rPr>
+          <w:b w:val="false"/>
+          <w:bCs w:val="false"/>
+        </w:rPr>
+        <w:t xml:space="preserve">Writable confirms FormuLab can actually save to that folder.</w:t>
+      </w:r>
+    </w:p>
+    <w:p>
+      <w:pPr>
+        <w:pStyle w:val="ListParagraph"/>
+        <w:numPr>
+          <w:ilvl w:val="0"/>
+          <w:numId w:val="1"/>
+        </w:numPr>
+      </w:pPr>
+      <w:r>
+        <w:rPr>
+          <w:b w:val="false"/>
+          <w:bCs w:val="false"/>
+        </w:rPr>
+        <w:t xml:space="preserve">Any problem — a broken or missing override, an unwritable folder, or a second folder elsewhere that also contains real project data — appears as a clear warning here. FormuLab never merges or moves data on its own when this happens; you decide what to do.</w:t>
+      </w:r>
+    </w:p>
+    <w:p>
+      <w:pPr>
+        <w:pStyle w:val="ListParagraph"/>
+        <w:numPr>
+          <w:ilvl w:val="0"/>
+          <w:numId w:val="1"/>
+        </w:numPr>
+      </w:pPr>
+      <w:r>
+        <w:rPr>
+          <w:b w:val="false"/>
+          <w:bCs w:val="false"/>
+        </w:rPr>
+        <w:t xml:space="preserve">Open Folder reveals the resolved location in Explorer/Finder. Refresh re-checks it.</w:t>
+      </w:r>
+    </w:p>
+    <w:p>
+      <w:pPr>
+        <w:pStyle w:val="ListParagraph"/>
+        <w:numPr>
+          <w:ilvl w:val="0"/>
+          <w:numId w:val="1"/>
+        </w:numPr>
+      </w:pPr>
+      <w:r>
+        <w:rPr>
+          <w:b w:val="false"/>
+          <w:bCs w:val="false"/>
+        </w:rPr>
+        <w:t xml:space="preserve">Change Location picks a folder and checks whether it's a safe move target: an empty folder can be moved into; a folder that already holds another FormuLab project's data cannot (use "Use Existing Location" for that instead — see below); a folder with unrelated files in it is refused outright, never merged. Free space and write access are checked before anything happens.</w:t>
+      </w:r>
+    </w:p>
+    <w:p>
+      <w:pPr>
+        <w:pStyle w:val="ListParagraph"/>
+        <w:numPr>
+          <w:ilvl w:val="0"/>
+          <w:numId w:val="1"/>
+        </w:numPr>
+      </w:pPr>
+      <w:r>
+        <w:rPr>
+          <w:b w:val="false"/>
+          <w:bCs w:val="false"/>
+        </w:rPr>
+        <w:t xml:space="preserve">Move Data (shown once a valid empty destination is chosen, and only after you confirm) makes a verified safety backup of your current data first, then copies every file to the new location and checks its size and SHA256 hash before activating anything. Your previous location is never touched or deleted — it stays exactly as it was until you separately confirm cleanup (below). Live progress is shown, and the move can be cancelled.</w:t>
+      </w:r>
+    </w:p>
+    <w:p>
+      <w:pPr>
+        <w:pStyle w:val="ListParagraph"/>
+        <w:numPr>
+          <w:ilvl w:val="0"/>
+          <w:numId w:val="1"/>
+        </w:numPr>
+      </w:pPr>
+      <w:r>
+        <w:rPr>
+          <w:b w:val="false"/>
+          <w:bCs w:val="false"/>
+        </w:rPr>
+        <w:t xml:space="preserve">Use Existing Location points FormuLab at a folder that already contains a real FormuLab project — nothing is copied. A safety backup of your *current* data is still made first, in case you picked the wrong folder.</w:t>
+      </w:r>
+    </w:p>
+    <w:p>
+      <w:pPr>
+        <w:pStyle w:val="ListParagraph"/>
+        <w:numPr>
+          <w:ilvl w:val="0"/>
+          <w:numId w:val="1"/>
+        </w:numPr>
+      </w:pPr>
+      <w:r>
+        <w:rPr>
+          <w:b w:val="false"/>
+          <w:bCs w:val="false"/>
+        </w:rPr>
+        <w:t xml:space="preserve">Restore Default clears your chosen workspace folder and falls back to the built-in default. This only changes where FormuLab looks — no files are moved or deleted.</w:t>
+      </w:r>
+    </w:p>
+    <w:p>
+      <w:pPr>
+        <w:pStyle w:val="ListParagraph"/>
+        <w:numPr>
+          <w:ilvl w:val="0"/>
+          <w:numId w:val="1"/>
+        </w:numPr>
+      </w:pPr>
+      <w:r>
+        <w:rPr>
+          <w:b w:val="false"/>
+          <w:bCs w:val="false"/>
+        </w:rPr>
+        <w:t xml:space="preserve">After a successful move, an optional Clean Up Old Location action appears — it permanently deletes everything at the previous location, and requires its own separate confirmation. It is never automatic.</w:t>
+      </w:r>
+    </w:p>
+    <w:p>
+      <w:pPr>
+        <w:pStyle w:val="ListParagraph"/>
+        <w:numPr>
+          <w:ilvl w:val="0"/>
+          <w:numId w:val="1"/>
+        </w:numPr>
+      </w:pPr>
+      <w:r>
+        <w:rPr>
+          <w:b w:val="false"/>
+          <w:bCs w:val="false"/>
+        </w:rPr>
+        <w:t xml:space="preserve">If FormuLab was closed or crashed during a move, an interrupted-move banner appears the next time you open this card, with a Resume action that safely finishes the move if it's safe to do so, or rolls back to your previous location — you are told which happened.</w:t>
+      </w:r>
+    </w:p>
+    <w:p>
+      <w:r>
+        <w:rPr>
+          <w:b w:val="false"/>
+          <w:bCs w:val="false"/>
+        </w:rPr>
+        <w:t xml:space="preserve">Settings → General → Diagnostics — a snapshot for troubleshooting, and a way to share one safely.</w:t>
+      </w:r>
+    </w:p>
+    <w:p>
+      <w:pPr>
+        <w:pStyle w:val="ListParagraph"/>
+        <w:numPr>
+          <w:ilvl w:val="0"/>
+          <w:numId w:val="1"/>
+        </w:numPr>
+      </w:pPr>
+      <w:r>
+        <w:rPr>
+          <w:b w:val="false"/>
+          <w:bCs w:val="false"/>
+        </w:rPr>
+        <w:t xml:space="preserve">Shows your app version, OS, active data path, free disk space, schema version and pending migrations, your last known backup, storage health (whether every data file on disk is actually readable), the log folder location, and recent log lines that mention an error.</w:t>
+      </w:r>
+    </w:p>
+    <w:p>
+      <w:pPr>
+        <w:pStyle w:val="ListParagraph"/>
+        <w:numPr>
+          <w:ilvl w:val="0"/>
+          <w:numId w:val="1"/>
+        </w:numPr>
+      </w:pPr>
+      <w:r>
+        <w:rPr>
+          <w:b w:val="false"/>
+          <w:bCs w:val="false"/>
+        </w:rPr>
+        <w:t xml:space="preserve">Open Log Folder reveals where debug.log lives.</w:t>
+      </w:r>
+    </w:p>
+    <w:p>
+      <w:pPr>
+        <w:pStyle w:val="ListParagraph"/>
+        <w:numPr>
+          <w:ilvl w:val="0"/>
+          <w:numId w:val="1"/>
+        </w:numPr>
+      </w:pPr>
+      <w:r>
+        <w:rPr>
+          <w:b w:val="false"/>
+          <w:bCs w:val="false"/>
+        </w:rPr>
+        <w:t xml:space="preserve">Copy Summary copies a plain-text version you can paste anywhere.</w:t>
+      </w:r>
+    </w:p>
+    <w:p>
+      <w:pPr>
+        <w:pStyle w:val="ListParagraph"/>
+        <w:numPr>
+          <w:ilvl w:val="0"/>
+          <w:numId w:val="1"/>
+        </w:numPr>
+      </w:pPr>
+      <w:r>
+        <w:rPr>
+          <w:b w:val="false"/>
+          <w:bCs w:val="false"/>
+        </w:rPr>
+        <w:t xml:space="preserve">Export Support Bundle saves a sanitized file you can send to someone for help: your Windows username and any long token/key-like string are stripped out of every path and log line, and it never contains a backup's actual contents, your formula/project data, or anything from browser storage (where your model API key lives) — only counts, health, and redacted log lines.</w:t>
+      </w:r>
+    </w:p>
+    <w:p>
+      <w:pPr>
+        <w:pStyle w:val="ListParagraph"/>
+        <w:numPr>
+          <w:ilvl w:val="0"/>
+          <w:numId w:val="1"/>
+        </w:numPr>
+      </w:pPr>
+      <w:r>
+        <w:rPr>
+          <w:b w:val="false"/>
+          <w:bCs w:val="false"/>
+        </w:rPr>
+        <w:t xml:space="preserve">"Recent errors" is a best-effort scan of the log for lines mentioning a problem — FormuLab does not have crash-dump reporting.</w:t>
+      </w:r>
+    </w:p>
+    <w:p>
+      <w:r>
+        <w:rPr>
+          <w:b w:val="false"/>
+          <w:bCs w:val="false"/>
+        </w:rPr>
+        <w:t xml:space="preserve">Settings → General → Backup and Recovery — save a portable copy of your data, or restore from one.</w:t>
+      </w:r>
+    </w:p>
+    <w:p>
+      <w:pPr>
+        <w:pStyle w:val="ListParagraph"/>
+        <w:numPr>
+          <w:ilvl w:val="0"/>
+          <w:numId w:val="1"/>
+        </w:numPr>
+      </w:pPr>
+      <w:r>
+        <w:rPr>
+          <w:b w:val="false"/>
+          <w:bCs w:val="false"/>
+        </w:rPr>
+        <w:t xml:space="preserve">Create Backup packages your formulations, master data (materials, suppliers, trials, stability, regulatory, dossiers, claims, labels, DOE, and every other collection), your session/formula library, and your run/provenance history into a single .formulab-backup file you choose the name and location for. A summary (file count, size, any warnings) appears when it finishes.</w:t>
+      </w:r>
+    </w:p>
+    <w:p>
+      <w:pPr>
+        <w:pStyle w:val="ListParagraph"/>
+        <w:numPr>
+          <w:ilvl w:val="0"/>
+          <w:numId w:val="1"/>
+        </w:numPr>
+      </w:pPr>
+      <w:r>
+        <w:rPr>
+          <w:b w:val="false"/>
+          <w:bCs w:val="false"/>
+        </w:rPr>
+        <w:t xml:space="preserve">Restore Backup picks an existing .formulab-backup file, shows you what it contains before anything happens, and asks you to confirm — restoring replaces your current data. A safety backup of your current data is made automatically first, so a failed or unwanted restore can always be undone; its path is shown to you when the restore finishes.</w:t>
+      </w:r>
+    </w:p>
+    <w:p>
+      <w:pPr>
+        <w:pStyle w:val="ListParagraph"/>
+        <w:numPr>
+          <w:ilvl w:val="0"/>
+          <w:numId w:val="1"/>
+        </w:numPr>
+      </w:pPr>
+      <w:r>
+        <w:rPr>
+          <w:b w:val="false"/>
+          <w:bCs w:val="false"/>
+        </w:rPr>
+        <w:t xml:space="preserve">Verify Backup checks a .formulab-backup file without restoring it or touching your current data at all — useful before trusting an old backup, or one you received from somewhere else. It reports one of five results: Valid, Valid, with warnings, Incompatible (a version this build doesn't support — not the same thing as a damaged file), Corrupted (the file itself is damaged — a bad hash, a missing piece, broken JSON), or Unsafe (the package contains something FormuLab will never allow — a path trying to escape its folder, a symbolic link, .FormuLab/runs.db, or an executable file). Every error and warning found is listed individually.</w:t>
+      </w:r>
+    </w:p>
+    <w:p>
+      <w:pPr>
+        <w:pStyle w:val="ListParagraph"/>
+        <w:numPr>
+          <w:ilvl w:val="0"/>
+          <w:numId w:val="1"/>
+        </w:numPr>
+      </w:pPr>
+      <w:r>
+        <w:rPr>
+          <w:b w:val="false"/>
+          <w:bCs w:val="false"/>
+        </w:rPr>
+        <w:t xml:space="preserve">Create/Restore both show live progress and can be cancelled; Verify is a quick, read-only check.</w:t>
+      </w:r>
+    </w:p>
+    <w:p>
+      <w:pPr>
+        <w:pStyle w:val="ListParagraph"/>
+        <w:numPr>
+          <w:ilvl w:val="0"/>
+          <w:numId w:val="1"/>
+        </w:numPr>
+      </w:pPr>
+      <w:r>
+        <w:rPr>
+          <w:b w:val="false"/>
+          <w:bCs w:val="false"/>
+        </w:rPr>
+        <w:t xml:space="preserve">What's included: formulations, all master-data collections, sessions, the formula library, and your run/provenance/compute history. What's excluded: .FormuLab/runs.db (a disposable index rebuilt automatically, never touched by backup or restore), the webview cache (which is also where your LLM provider API key lives — never included in a backup), and data/literature (the shared open-access paper cache — re-fetched through ordinary use, not something you authored, so it's left out and noted as a warning when skipped).</w:t>
+      </w:r>
+    </w:p>
+    <w:p>
+      <w:pPr>
+        <w:pStyle w:val="ListParagraph"/>
+        <w:numPr>
+          <w:ilvl w:val="0"/>
+          <w:numId w:val="1"/>
+        </w:numPr>
+      </w:pPr>
+      <w:r>
+        <w:rPr>
+          <w:b w:val="false"/>
+          <w:bCs w:val="false"/>
+        </w:rPr>
+        <w:t xml:space="preserve">Restore only ever writes into this machine's own data folder — a backup made on another computer never overwrites where your workspace or formulab-root.txt override points here.</w:t>
+      </w:r>
+    </w:p>
+    <w:p>
+      <w:pPr>
+        <w:pStyle w:val="ListParagraph"/>
+        <w:numPr>
+          <w:ilvl w:val="0"/>
+          <w:numId w:val="1"/>
+        </w:numPr>
+      </w:pPr>
+      <w:r>
+        <w:rPr>
+          <w:b w:val="false"/>
+          <w:bCs w:val="false"/>
+        </w:rPr>
+        <w:t xml:space="preserve">Not yet available: a backup history list — planned for a later Phase 11 session.</w:t>
+      </w:r>
+    </w:p>
+    <w:p>
+      <w:r>
+        <w:rPr>
+          <w:b w:val="false"/>
+          <w:bCs w:val="false"/>
+        </w:rPr>
+        <w:t xml:space="preserve">Settings → General → Automatic Backups — turns on scheduled daily/weekly backups, backup on exit, and retention, using the exact same .formulab-backup package Backup and Recovery creates.</w:t>
+      </w:r>
+    </w:p>
+    <w:p>
+      <w:pPr>
+        <w:pStyle w:val="ListParagraph"/>
+        <w:numPr>
+          <w:ilvl w:val="0"/>
+          <w:numId w:val="1"/>
+        </w:numPr>
+      </w:pPr>
+      <w:r>
+        <w:rPr>
+          <w:b w:val="false"/>
+          <w:bCs w:val="false"/>
+        </w:rPr>
+        <w:t xml:space="preserve">Automatic backups is off by default. Turning it on reveals a destination folder (choose one — daily and weekly backups are written there; pre-migration backups always stay in FormuLab's own private storage, unchanged from Schema Migration's existing behavior), a Daily backup and Weekly backup toggle (each with its own "backups to keep" count — 7 and 4 by default), and Back up on exit (creates a backup, classified as a daily one, when you close FormuLab if one hasn't already run today).</w:t>
+      </w:r>
+    </w:p>
+    <w:p>
+      <w:pPr>
+        <w:pStyle w:val="ListParagraph"/>
+        <w:numPr>
+          <w:ilvl w:val="0"/>
+          <w:numId w:val="1"/>
+        </w:numPr>
+      </w:pPr>
+      <w:r>
+        <w:rPr>
+          <w:b w:val="false"/>
+          <w:bCs w:val="false"/>
+        </w:rPr>
+        <w:t xml:space="preserve">Pre-migration backups kept (default 2) is always visible and always applies, whether or not automatic backups are turned on — FormuLab already backs up your data before every schema migration; this only bounds how many of those it keeps.</w:t>
+      </w:r>
+    </w:p>
+    <w:p>
+      <w:pPr>
+        <w:pStyle w:val="ListParagraph"/>
+        <w:numPr>
+          <w:ilvl w:val="0"/>
+          <w:numId w:val="1"/>
+        </w:numPr>
+      </w:pPr>
+      <w:r>
+        <w:rPr>
+          <w:b w:val="false"/>
+          <w:bCs w:val="false"/>
+        </w:rPr>
+        <w:t xml:space="preserve">Every automatic backup is verified the same way Verify Backup checks a package before it counts as successful — a backup that fails verification is deleted immediately, never left on disk pretending to be a real backup.</w:t>
+      </w:r>
+    </w:p>
+    <w:p>
+      <w:pPr>
+        <w:pStyle w:val="ListParagraph"/>
+        <w:numPr>
+          <w:ilvl w:val="0"/>
+          <w:numId w:val="1"/>
+        </w:numPr>
+      </w:pPr>
+      <w:r>
+        <w:rPr>
+          <w:b w:val="false"/>
+          <w:bCs w:val="false"/>
+        </w:rPr>
+        <w:t xml:space="preserve">Retention keeps the newest N backups per class (daily/weekly/ pre-migration) and removes older ones — but never deletes the last remaining valid backup of a class, even if you set the count very low. A backup interrupted by a crash (a leftover, incomplete .tmp file) is cleaned up the next time that class runs.</w:t>
+      </w:r>
+    </w:p>
+    <w:p>
+      <w:pPr>
+        <w:pStyle w:val="ListParagraph"/>
+        <w:numPr>
+          <w:ilvl w:val="0"/>
+          <w:numId w:val="1"/>
+        </w:numPr>
+      </w:pPr>
+      <w:r>
+        <w:rPr>
+          <w:b w:val="false"/>
+          <w:bCs w:val="false"/>
+        </w:rPr>
+        <w:t xml:space="preserve">Run Automatic Backup Now runs one immediately (as a daily-classed backup) — useful to test your destination folder or get an extra backup without waiting for the schedule.</w:t>
+      </w:r>
+    </w:p>
+    <w:p>
+      <w:pPr>
+        <w:pStyle w:val="ListParagraph"/>
+        <w:numPr>
+          <w:ilvl w:val="0"/>
+          <w:numId w:val="1"/>
+        </w:numPr>
+      </w:pPr>
+      <w:r>
+        <w:rPr>
+          <w:b w:val="false"/>
+          <w:bCs w:val="false"/>
+        </w:rPr>
+        <w:t xml:space="preserve">Status shows the next eligible run, and your last successful and last failed automatic backup (with the reason, for a failure). A failed automatic backup also shows a system notification if you've allowed FormuLab to send them.</w:t>
+      </w:r>
+    </w:p>
+    <w:p>
+      <w:pPr>
+        <w:pStyle w:val="ListParagraph"/>
+        <w:numPr>
+          <w:ilvl w:val="0"/>
+          <w:numId w:val="1"/>
+        </w:numPr>
+      </w:pPr>
+      <w:r>
+        <w:rPr>
+          <w:b w:val="false"/>
+          <w:bCs w:val="false"/>
+        </w:rPr>
+        <w:t xml:space="preserve">Two backups can never run at the same time — a manual backup/restore in progress, or another automatic backup already running, makes a new automatic run report itself as failed (not an error dialog) rather than colliding.</w:t>
+      </w:r>
+    </w:p>
+    <w:p>
+      <w:pPr>
+        <w:pStyle w:val="ListParagraph"/>
+        <w:numPr>
+          <w:ilvl w:val="0"/>
+          <w:numId w:val="1"/>
+        </w:numPr>
+      </w:pPr>
+      <w:r>
+        <w:rPr>
+          <w:b w:val="false"/>
+          <w:bCs w:val="false"/>
+        </w:rPr>
+        <w:t xml:space="preserve">Important limitation, stated honestly: FormuLab has no background service. Automatic backups only run while the app is actually open — on launch, periodically while you're using it, and on exit if you've enabled that. A day or week where you never open FormuLab simply has no automatic backup for that day or week.</w:t>
+      </w:r>
+    </w:p>
+    <w:p>
+      <w:r>
+        <w:rPr>
+          <w:b w:val="false"/>
+          <w:bCs w:val="false"/>
+        </w:rPr>
+        <w:t xml:space="preserve">Settings → General → Schema Migration — shows the data schema version your project is currently at, and whether anything needs updating for this version of FormuLab.</w:t>
+      </w:r>
+    </w:p>
+    <w:p>
+      <w:pPr>
+        <w:pStyle w:val="ListParagraph"/>
+        <w:numPr>
+          <w:ilvl w:val="0"/>
+          <w:numId w:val="1"/>
+        </w:numPr>
+      </w:pPr>
+      <w:r>
+        <w:rPr>
+          <w:b w:val="false"/>
+          <w:bCs w:val="false"/>
+        </w:rPr>
+        <w:t xml:space="preserve">Dry Run shows exactly what a migration would change — which collections, how many rows — without touching anything.</w:t>
+      </w:r>
+    </w:p>
+    <w:p>
+      <w:pPr>
+        <w:pStyle w:val="ListParagraph"/>
+        <w:numPr>
+          <w:ilvl w:val="0"/>
+          <w:numId w:val="1"/>
+        </w:numPr>
+      </w:pPr>
+      <w:r>
+        <w:rPr>
+          <w:b w:val="false"/>
+          <w:bCs w:val="false"/>
+        </w:rPr>
+        <w:t xml:space="preserve">Run Migration (only enabled when something is actually pending) makes a verified safety backup first, migrates one collection at a time, and automatically restores that backup if anything fails partway — you are told whether the restore succeeded.</w:t>
+      </w:r>
+    </w:p>
+    <w:p>
+      <w:pPr>
+        <w:pStyle w:val="ListParagraph"/>
+        <w:numPr>
+          <w:ilvl w:val="0"/>
+          <w:numId w:val="1"/>
+        </w:numPr>
+      </w:pPr>
+      <w:r>
+        <w:rPr>
+          <w:b w:val="false"/>
+          <w:bCs w:val="false"/>
+        </w:rPr>
+        <w:t xml:space="preserve">If FormuLab was closed or crashed during a migration, an An earlier migration did not finish banner appears with a one-click Restore Pre-Migration Backup action.</w:t>
+      </w:r>
+    </w:p>
+    <w:p>
+      <w:pPr>
+        <w:pStyle w:val="ListParagraph"/>
+        <w:numPr>
+          <w:ilvl w:val="0"/>
+          <w:numId w:val="1"/>
+        </w:numPr>
+      </w:pPr>
+      <w:r>
+        <w:rPr>
+          <w:b w:val="false"/>
+          <w:bCs w:val="false"/>
+        </w:rPr>
+        <w:t xml:space="preserve">If your project's data was created by a newer version of FormuLab than the one you're running, you'll see a clear message asking you to update rather than a confusing error.</w:t>
+      </w:r>
+    </w:p>
+    <w:p>
+      <w:pPr>
+        <w:pStyle w:val="ListParagraph"/>
+        <w:numPr>
+          <w:ilvl w:val="0"/>
+          <w:numId w:val="1"/>
+        </w:numPr>
+      </w:pPr>
+      <w:r>
+        <w:rPr>
+          <w:b w:val="false"/>
+          <w:bCs w:val="false"/>
+        </w:rPr>
+        <w:t xml:space="preserve">As of this version, every collection is already current — Run Migration will normally show nothing pending.</w:t>
+      </w:r>
+    </w:p>
+    <w:p>
+      <w:r>
+        <w:rPr>
+          <w:b w:val="false"/>
+          <w:bCs w:val="false"/>
+        </w:rPr>
+        <w:t xml:space="preserve">Settings → General → App Updates — checks whether a newer FormuLab release exists. This checks only — it never downloads or installs anything.</w:t>
+      </w:r>
+    </w:p>
+    <w:p>
+      <w:pPr>
+        <w:pStyle w:val="ListParagraph"/>
+        <w:numPr>
+          <w:ilvl w:val="0"/>
+          <w:numId w:val="1"/>
+        </w:numPr>
+      </w:pPr>
+      <w:r>
+        <w:rPr>
+          <w:b w:val="false"/>
+          <w:bCs w:val="false"/>
+        </w:rPr>
+        <w:t xml:space="preserve">Current version is always shown, so you know what you're comparing against.</w:t>
+      </w:r>
+    </w:p>
+    <w:p>
+      <w:pPr>
+        <w:pStyle w:val="ListParagraph"/>
+        <w:numPr>
+          <w:ilvl w:val="0"/>
+          <w:numId w:val="1"/>
+        </w:numPr>
+      </w:pPr>
+      <w:r>
+        <w:rPr>
+          <w:b w:val="false"/>
+          <w:bCs w:val="false"/>
+        </w:rPr>
+        <w:t xml:space="preserve">Check for Updates runs an immediate, manual check. Check automatically on launch (on by default) runs one check per launch, at most as often as the check frequency you choose (every 6/12 hours, daily, every 3 days, or weekly).</w:t>
+      </w:r>
+    </w:p>
+    <w:p>
+      <w:pPr>
+        <w:pStyle w:val="ListParagraph"/>
+        <w:numPr>
+          <w:ilvl w:val="0"/>
+          <w:numId w:val="1"/>
+        </w:numPr>
+      </w:pPr>
+      <w:r>
+        <w:rPr>
+          <w:b w:val="false"/>
+          <w:bCs w:val="false"/>
+        </w:rPr>
+        <w:t xml:space="preserve">Status is always one of: Not checked yet, Checking…, Up to date, Update available, Check failed, or Offline (no connection to the update server) — the last checked time is always shown alongside it.</w:t>
+      </w:r>
+    </w:p>
+    <w:p>
+      <w:pPr>
+        <w:pStyle w:val="ListParagraph"/>
+        <w:numPr>
+          <w:ilvl w:val="0"/>
+          <w:numId w:val="1"/>
+        </w:numPr>
+      </w:pPr>
+      <w:r>
+        <w:rPr>
+          <w:b w:val="false"/>
+          <w:bCs w:val="false"/>
+        </w:rPr>
+        <w:t xml:space="preserve">When an update is available, you see its version, publish date, and release notes (shown as plain text — never treated as HTML), plus whether a build for your platform was actually found in that release.</w:t>
+      </w:r>
+    </w:p>
+    <w:p>
+      <w:pPr>
+        <w:pStyle w:val="ListParagraph"/>
+        <w:numPr>
+          <w:ilvl w:val="0"/>
+          <w:numId w:val="1"/>
+        </w:numPr>
+      </w:pPr>
+      <w:r>
+        <w:rPr>
+          <w:b w:val="false"/>
+          <w:bCs w:val="false"/>
+        </w:rPr>
+        <w:t xml:space="preserve">View Release / Download opens the release page in your browser — FormuLab does not download or run an installer for you; you get the new version from the release page yourself.</w:t>
+      </w:r>
+    </w:p>
+    <w:p>
+      <w:pPr>
+        <w:pStyle w:val="ListParagraph"/>
+        <w:numPr>
+          <w:ilvl w:val="0"/>
+          <w:numId w:val="1"/>
+        </w:numPr>
+      </w:pPr>
+      <w:r>
+        <w:rPr>
+          <w:b w:val="false"/>
+          <w:bCs w:val="false"/>
+        </w:rPr>
+        <w:t xml:space="preserve">Ignore This Version stops that specific version from being flagged as available again — a genuinely newer release still gets flagged normally. Clear Ignored Version undoes this at any time.</w:t>
+      </w:r>
+    </w:p>
+    <w:p>
+      <w:pPr>
+        <w:pStyle w:val="ListParagraph"/>
+        <w:numPr>
+          <w:ilvl w:val="0"/>
+          <w:numId w:val="1"/>
+        </w:numPr>
+      </w:pPr>
+      <w:r>
+        <w:rPr>
+          <w:b w:val="false"/>
+          <w:bCs w:val="false"/>
+        </w:rPr>
+        <w:t xml:space="preserve">Show Settings badge shows a small dot on the Settings entry when an update is available (and not ignored).</w:t>
+      </w:r>
+    </w:p>
+    <w:p>
+      <w:pPr>
+        <w:pStyle w:val="ListParagraph"/>
+        <w:numPr>
+          <w:ilvl w:val="0"/>
+          <w:numId w:val="1"/>
+        </w:numPr>
+      </w:pPr>
+      <w:r>
+        <w:rPr>
+          <w:b w:val="false"/>
+          <w:bCs w:val="false"/>
+        </w:rPr>
+        <w:t xml:space="preserve">A newly detected update also shows a system notification, once per version — checking again never repeats it for the same version.</w:t>
+      </w:r>
+    </w:p>
+    <w:p>
+      <w:pPr>
+        <w:pStyle w:val="ListParagraph"/>
+        <w:numPr>
+          <w:ilvl w:val="0"/>
+          <w:numId w:val="1"/>
+        </w:numPr>
+      </w:pPr>
+      <w:r>
+        <w:rPr>
+          <w:b w:val="false"/>
+          <w:bCs w:val="false"/>
+        </w:rPr>
+        <w:t xml:space="preserve">Only one HTTPS endpoint is contacted (GitHub's public releases API by default) — no workspace files, formulas, or API keys are ever sent.</w:t>
+      </w:r>
+    </w:p>
+    <w:p>
+      <w:pPr>
+        <w:pStyle w:val="ListParagraph"/>
+        <w:numPr>
+          <w:ilvl w:val="0"/>
+          <w:numId w:val="1"/>
+        </w:numPr>
+      </w:pPr>
+      <w:r>
+        <w:rPr>
+          <w:b w:val="false"/>
+          <w:bCs w:val="false"/>
+        </w:rPr>
+        <w:t xml:space="preserve">Signed installers and automatic update installation are not part of this version — planned for a later phase.</w:t>
       </w:r>
     </w:p>
     <w:p>

</xml_diff>

<commit_message>
feat(v01): improve supplier product card comparison search
</commit_message>
<xml_diff>
--- a/docs/generated/FormuLab-User-Guide.docx
+++ b/docs/generated/FormuLab-User-Guide.docx
@@ -300,7 +300,7 @@
           <w:b w:val="false"/>
           <w:bCs w:val="false"/>
         </w:rPr>
-        <w:t xml:space="preserve">Sessions (the sidebar's pinned bottom section, or Ctrl/Cmd+B's default landing page) opens the composer at /live — FormuLab's front door for a brand-new idea, distinct from the Formulation project workspace described from §1 onward.</w:t>
+        <w:t xml:space="preserve">Sessions (the sidebar's pinned bottom section, or Ctrl/Cmd+B's default landing page) opens the composer at /formulation-request — FormuLab's front door for a brand-new idea, distinct from the Formulation project workspace described from §1 onward.</w:t>
       </w:r>
     </w:p>
     <w:p>
@@ -1481,6 +1481,15 @@
           <w:bCs w:val="false"/>
         </w:rPr>
         <w:t xml:space="preserve">Two templates — Stability Protocols and Stability Results — preview and validate normally but cannot yet be committed (a stability study needs a frozen formula/packaging snapshot that a spreadsheet row can't safely provide); importing one reports every row honestly skipped rather than silently doing nothing or faking success.</w:t>
+      </w:r>
+    </w:p>
+    <w:p>
+      <w:r>
+        <w:rPr>
+          <w:b w:val="false"/>
+          <w:bCs w:val="false"/>
+        </w:rPr>
+        <w:t xml:space="preserve">The existing Connector Management area also includes supplier document acquisition, SDS extraction review, and a Commercial Product Resolver. The resolver browses persistent product cards created from acquired SDS or TDS documents, with document versions, cited claims, identity status, and conflicts. Search the RawMaterial list by code, name, trade name, or INCI, then compare a selected material with exact product-level candidates and disclosed Section 3 component candidates. Section 3 components remain separate from the commercial product identity. This comparison does not create or change RawMaterial records; any field update must go through the existing authorized review and Data Exchange commit flow. Missing or conflicting supplier evidence remains visible as unresolved.</w:t>
       </w:r>
     </w:p>
     <w:p>

</xml_diff>